<commit_message>
Add professor slides ESL script and measured-results report
</commit_message>
<xml_diff>
--- a/reports/crm/final/deliverables/SPEAKER_SCRIPT_ESL.docx
+++ b/reports/crm/final/deliverables/SPEAKER_SCRIPT_ESL.docx
@@ -7,247 +7,304 @@
         <w:pStyle w:val="Title"/>
       </w:pPr>
       <w:r>
-        <w:t>CS 582 — Speaking notes</w:t>
+        <w:t>CRM presentation script</w:t>
       </w:r>
     </w:p>
     <w:p>
       <w:r>
-        <w:t>Natural ESL presentation script</w:t>
+        <w:t>Suggested speaking allocation only. This does not claim each member performed these development tasks. Target 11 minutes (allow 10–12 minutes) including a short live command. Speaking order: Hong Thai Phan (slides 1–4, 0:00–3:40), Nguyen Khanh An Tran (slides 5–8, 3:40–7:20), Hoang Thien Bao Bui (slides 9–12, 7:20–11:00). This is presentation allocation, not a claim about development authorship. Aim for 100–115 words per minute. Rehearse once with a timer. The timings include the live demonstration. Questions can follow after the 11 minutes.</w:t>
+      </w:r>
+    </w:p>
+    <w:p>
+      <w:pPr>
+        <w:pStyle w:val="Heading1"/>
+      </w:pPr>
+      <w:r>
+        <w:t>Slide 1 CRM sales decision support</w:t>
       </w:r>
     </w:p>
     <w:p>
       <w:r>
-        <w:t>Suggested allocation: 12 slides / 3 members / 4 slides each. About 8–10 minutes total at a comfortable speaking pace. Swap the names if the group prefers; these are speaking assignments, not claims about past contributions.</w:t>
+        <w:t>Hong Thai Phan | 0:00 to 0:45</w:t>
       </w:r>
     </w:p>
     <w:p>
       <w:r>
-        <w:t>Slide 1: CRM sales opportunities</w:t>
+        <w:t>Hello everyone. Our project studies sales opportunities in a CRM system. We want to estimate whether an opportunity will be won or lost, and help the user understand the score. Our system now includes a sales assistant that suggests review actions with evidence. Today we will show the problem, our data, the experiment, and a real model demo. We will also explain the limits of the measured results. These matter, because we want our conclusions to match what the data actually shows.</w:t>
+      </w:r>
+    </w:p>
+    <w:p>
+      <w:pPr>
+        <w:pStyle w:val="Heading1"/>
+      </w:pPr>
+      <w:r>
+        <w:t>Slide 2 The prediction task and its inputs</w:t>
       </w:r>
     </w:p>
     <w:p>
       <w:r>
-        <w:t>Hong Thai Phan</w:t>
+        <w:t>Hong Thai Phan | 0:45 to 1:40</w:t>
       </w:r>
     </w:p>
     <w:p>
       <w:r>
-        <w:t>Hello everyone. Our project is about predicting whether a CRM sales opportunity will be won or lost. We also want to show which inputs affect the model score. We have now completed the comparison of the models in our proposal. The main finding is that the available data gives us only a weak prediction signal. So today we will explain both the working system and its limits. We will start with the data, then show the evaluation, and finish with the outputs and next steps.</w:t>
+        <w:t>The source is a fictitious business that sells computer hardware. We connect four tables: sales opportunities, accounts, products, and sales teams. There are 8,800 opportunities in the supplied files. We learn from observed Won and Lost outcomes. An open deal is still unknown, so we never label it as Lost. The raw model uses eighteen pre-close attributes. The final close value and stage would reveal the answer. We exclude those fields from prediction, while keeping dates and IDs for auditing.</w:t>
+      </w:r>
+    </w:p>
+    <w:p>
+      <w:pPr>
+        <w:pStyle w:val="Heading1"/>
+      </w:pPr>
+      <w:r>
+        <w:t>Slide 3 A split that respects label availability</w:t>
       </w:r>
     </w:p>
     <w:p>
       <w:r>
-        <w:t>Slide 2: What goes into the decision?</w:t>
+        <w:t>Hong Thai Phan | 1:40 to 2:40</w:t>
       </w:r>
     </w:p>
     <w:p>
       <w:r>
-        <w:t>Hong Thai Phan</w:t>
+        <w:t>We split the records by engagement date. However, starting earlier does not mean the outcome was already known. For example, a deal might start in June and close in October. Its outcome cannot train a model used in July. Our split removes these late labels from the earlier periods. We also keep records from the same date together. All models use the same row assignments. This is an exploratory test, because we already inspected this dataset during the project. It is not a new external test.</w:t>
+      </w:r>
+    </w:p>
+    <w:p>
+      <w:pPr>
+        <w:pStyle w:val="Heading1"/>
+      </w:pPr>
+      <w:r>
+        <w:t>Slide 4 Historical features without future outcomes</w:t>
       </w:r>
     </w:p>
     <w:p>
       <w:r>
-        <w:t>We use four connected tables. The opportunity table gives us the product, sales agent and engagement date. The account table adds information such as industry, revenue and company size. The other tables add product price and sales team information. After preparation, we use eighteen predictors. We do not use the final close value, close date or deal stage as prediction inputs, because they can reveal the answer. We keep the opportunity ID only to connect a prediction back to its original record.</w:t>
+        <w:t>Hong Thai Phan | 2:40 to 3:40</w:t>
       </w:r>
     </w:p>
     <w:p>
       <w:r>
-        <w:t>Slide 3: Data prepared and checked</w:t>
+        <w:t>Our first extension is historical information. For each opportunity, we look backward from its engagement date. We only use other training deals that had already closed. A closure on the same day is excluded, because we do not know the time within that day. We calculate prior counts, smoothed win rates, average values, and cycle lengths. When history is missing, we use a documented prior and show a cold-start flag. Tests confirm that changing future outcomes does not change these features. An will now explain how we compare the models.</w:t>
+      </w:r>
+    </w:p>
+    <w:p>
+      <w:pPr>
+        <w:pStyle w:val="Heading1"/>
+        <w:pageBreakBefore/>
+      </w:pPr>
+      <w:r>
+        <w:t>Slide 5 A controlled model comparison</w:t>
       </w:r>
     </w:p>
     <w:p>
       <w:r>
-        <w:t>Hong Thai Phan</w:t>
+        <w:t>Nguyen Khanh An Tran | 3:40 to 4:35</w:t>
       </w:r>
     </w:p>
     <w:p>
       <w:r>
-        <w:t>The data contains 8,800 opportunities. We use the 6,711 closed records for supervised learning. The remaining records are still open. We score the 1,589 Engaging records, but leave out the 500 Prospecting records. We also fixed inconsistent product names and checked the table joins. An important issue is missing account information: 1,088 scored records have this warning. We make that visible because missing inputs can reduce how much we can trust a model score.</w:t>
+        <w:t>We compare six real models on CPU. The original models are Logistic Regression, Random Forest, MLP, and TabNet. We retain the dummy control and add CatBoost, which handles categorical data directly. Experiment A uses the original inputs. Experiment B adds the historical features. We fit preprocessing using training data only. Validation controls selection and early stopping. We save a selection record before evaluating either test set. This means a model with a better test score cannot silently become our final choice after we see the result.</w:t>
+      </w:r>
+    </w:p>
+    <w:p>
+      <w:pPr>
+        <w:pStyle w:val="Heading1"/>
+      </w:pPr>
+      <w:r>
+        <w:t>Slide 6 The measured effect of historical features</w:t>
       </w:r>
     </w:p>
     <w:p>
       <w:r>
-        <w:t>Slide 4: Respect what was known at the time</w:t>
+        <w:t>Nguyen Khanh An Tran | 4:35 to 5:40</w:t>
       </w:r>
     </w:p>
     <w:p>
       <w:r>
-        <w:t>Hong Thai Phan</w:t>
+        <w:t>Here are the measured test AUC values. For Logistic Regression, history has lower test AUC than raw inputs (B minus A -0.0070). This single exploratory comparison does not prove a general predictive benefit. The highest observed test AUC is 0.542, from raw / CatBoost. That is descriptive information, not our selection rule. We keep the validation winner. We do not switch models after seeing test results. The paper also includes accuracy, precision, recall, F1, calibration scores, and confusion counts for all twelve legitimate runs. This helps us judge the models from several perspectives.</w:t>
+      </w:r>
+    </w:p>
+    <w:p>
+      <w:pPr>
+        <w:pStyle w:val="Heading1"/>
+      </w:pPr>
+      <w:r>
+        <w:t>Slide 7 The leakage audit checks an invalid shortcut</w:t>
       </w:r>
     </w:p>
     <w:p>
       <w:r>
-        <w:t>We split by engagement date, but date order alone is not enough. Imagine a deal starts in June but closes in October. Its outcome was not known in July, so it should not train a model used at that time. We exclude records like this from the earlier training or validation period. Every model uses the same split. We also keep deals from the same date together. This is still an exploratory historical test, because we have already studied this dataset. Now my teammate will explain the models and results.</w:t>
+        <w:t>Nguyen Khanh An Tran | 5:40 to 6:30</w:t>
       </w:r>
     </w:p>
     <w:p>
       <w:r>
-        <w:t>Slide 5: Compare all promised models</w:t>
+        <w:t>We also run an intentionally invalid control. Its test AUC is 1.0000 using the final close value. However, the salesperson would not know that value when making the prediction. We keep this control outside the real model comparison and scoring. Historical average values are different: they come from other deals that already closed before the query date. This audit shows why checking data availability is more important than presenting an impressive number. Even if the diagnostic score changes on new data, this field remains invalid for pre-close prediction.</w:t>
+      </w:r>
+    </w:p>
+    <w:p>
+      <w:pPr>
+        <w:pStyle w:val="Heading1"/>
+      </w:pPr>
+      <w:r>
+        <w:t>Slide 8 The sales assistant has inspectable rules</w:t>
       </w:r>
     </w:p>
     <w:p>
       <w:r>
-        <w:t>Nguyen Khanh An Tran</w:t>
+        <w:t>Nguyen Khanh An Tran | 6:30 to 7:20</w:t>
       </w:r>
     </w:p>
     <w:p>
       <w:r>
-        <w:t>We trained all four models from our proposal, plus a simple control model. The control always gives the training win rate. Logistic Regression is our linear baseline, and Random Forest can learn more complex patterns. We also trained an MLP and TabNet on CPU. All preprocessing is fitted on the training set only. Validation data controls early stopping, model selection and the decision threshold. We did not choose the model using the test results. The saved settings let us repeat the comparison.</w:t>
+        <w:t>The assistant has two separate parts. The model estimates a probability and shows the inputs that affect its score. The rule layer then suggests review actions using that score and the historical context. For example, it asks the user to complete a missing account, or review product fit when enough prior product outcomes show a weaker pattern. Each action includes the rule name, observed evidence, and reason. These are transparent decision-support rules. We do not claim they cause more sales. Bao will now demonstrate a real opportunity.</w:t>
+      </w:r>
+    </w:p>
+    <w:p>
+      <w:pPr>
+        <w:pStyle w:val="Heading1"/>
+        <w:pageBreakBefore/>
+      </w:pPr>
+      <w:r>
+        <w:t>Slide 9 A real opportunity through the saved model</w:t>
       </w:r>
     </w:p>
     <w:p>
       <w:r>
-        <w:t>Slide 6: Results: weak discrimination</w:t>
+        <w:t>Hoang Thien Bao Bui | 7:20 to 8:50</w:t>
       </w:r>
     </w:p>
     <w:p>
       <w:r>
-        <w:t>Nguyen Khanh An Tran</w:t>
+        <w:t>For this demo, we use opportunity 01XZ9CRY, for Initech. I will run the demo command now. It loads the saved model, rebuilds the same historical features, and calculates the score again. The estimated win probability is about 53%. The actual outcome is still unknown. Below the score, we can see the strongest reference sensitivities and the assistant's review actions. The JSON version includes the supporting counts and timestamps. We choose this example by date, not because its score looks especially good.</w:t>
       </w:r>
     </w:p>
     <w:p>
       <w:r>
-        <w:t>Here are the actual test results. Logistic Regression was selected on validation, and its test AUC is about 0.52. An AUC of point five is the no-ranking baseline, so this result is only slightly above that level. The more advanced models did not give a convincing improvement in this run. Also, a model that predicts mostly Won can have a fairly high accuracy or F1 because Won is the larger class. That is why we show the control and several metrics together.</w:t>
+        <w:t>Demo cue: run the prepared src.demo command. Show the probability, one reason, and the evidence beneath one action. Allow about 20 seconds for the screen walkthrough.</w:t>
+      </w:r>
+    </w:p>
+    <w:p>
+      <w:pPr>
+        <w:pStyle w:val="Heading1"/>
+      </w:pPr>
+      <w:r>
+        <w:t>Slide 10 Reasons and evidence quality</w:t>
       </w:r>
     </w:p>
     <w:p>
       <w:r>
-        <w:t>Slide 7: A perfect score can be the wrong answer</w:t>
+        <w:t>Hoang Thien Bao Bui | 8:50 to 9:40</w:t>
       </w:r>
     </w:p>
     <w:p>
       <w:r>
-        <w:t>Nguyen Khanh An Tran</w:t>
+        <w:t>An explanation can make a weak model easier to inspect, but it cannot make that model accurate. Our main explanations change one input to a training reference and measure the score difference. These effects do not add up like SHAP values, and correlated features can make such changes unrealistic. We also keep a separate Random Forest TreeSHAP audit. Missing account information is another major issue in the open records. We show this warning explicitly. The assistant still requires human review and does not turn missing data into confident business advice.</w:t>
+      </w:r>
+    </w:p>
+    <w:p>
+      <w:pPr>
+        <w:pStyle w:val="Heading1"/>
+      </w:pPr>
+      <w:r>
+        <w:t>Slide 11 The contribution and its limits</w:t>
       </w:r>
     </w:p>
     <w:p>
       <w:r>
-        <w:t>We also ran a deliberately incorrect experiment to show the effect of data leakage. In these files, lost deals have zero close value. If we use that field, even a very small decision tree can almost directly recover the outcome. The score looks excellent, but the information is only known after the deal closes. So this would not help us predict a new opportunity. We keep this experiment only as an audit example. It is never used in the real prediction output.</w:t>
+        <w:t>Hoang Thien Bao Bui | 9:40 to 10:25</w:t>
       </w:r>
     </w:p>
     <w:p>
       <w:r>
-        <w:t>Slide 8: Show what influences the score</w:t>
+        <w:t>Our novelty is an applied system contribution. We combine a leakage audit, a tested historical feature engine, and a deterministic sales assistant with traceable evidence. We are not presenting a newly invented learning algorithm. The paired comparison shows the measured effect of adding history for this dataset. It does not establish a general improvement. The training archive is frozen, the account tables are static, and the data contains only observed closed outcomes for evaluation. Stronger future evidence would require richer activity data, new periods, and a prospective study of actual decisions.</w:t>
+      </w:r>
+    </w:p>
+    <w:p>
+      <w:pPr>
+        <w:pStyle w:val="Heading1"/>
+      </w:pPr>
+      <w:r>
+        <w:t>Slide 12 Reproducible delivery and next steps</w:t>
       </w:r>
     </w:p>
     <w:p>
       <w:r>
-        <w:t>Nguyen Khanh An Tran</w:t>
+        <w:t>Hoang Thien Bao Bui | 10:25 to 11:00</w:t>
       </w:r>
     </w:p>
     <w:p>
       <w:r>
-        <w:t>For each scored opportunity, we show which inputs increase or decrease the model score compared with a training reference. For example, we replace one numeric value with its training median and measure the probability change. These changes help explain the model, but they are not additive SHAP values. Separately, we computed TreeSHAP for the raw Random Forest and checked that its contributions reconstruct the prediction. We clearly label the two methods. Neither method proves cause and effect. My teammate will now show the output and practical limits.</w:t>
+        <w:t>To finish, one command runs the full experiment and creates our results. The notebook uses the same code as this demo. We check the time rules and confirm that saved models reproduce the exported scores. Our next step is to test richer sales activity data and evaluate new opportunities. We will also rehearse in Colab and check the slide layout before presenting. Thank you. We are happy to answer your questions.</w:t>
+      </w:r>
+    </w:p>
+    <w:p>
+      <w:pPr>
+        <w:pStyle w:val="Heading1"/>
+        <w:pageBreakBefore/>
+      </w:pPr>
+      <w:r>
+        <w:t>Natural ESL answers for questions</w:t>
       </w:r>
     </w:p>
     <w:p>
       <w:r>
-        <w:t>Slide 9: Two outputs, with an honest context</w:t>
+        <w:t>Why can a win probability above 50 percent still have a Lost label? We choose the classification threshold on validation data. It is about 61 percent for this saved run, rather than a fixed 50 percent. The probability, class label and loss-risk band answer different questions.</w:t>
       </w:r>
     </w:p>
     <w:p>
       <w:r>
-        <w:t>Hoang Thien Bao Bui</w:t>
+        <w:t>What is new here? Our contribution combines a tested time-aware history engine, a leakage audit, and a sales assistant that explains each suggested review action. We use existing learning algorithms. We do not claim a new algorithm or proven sales improvement.</w:t>
       </w:r>
     </w:p>
     <w:p>
       <w:r>
-        <w:t>The first output is the estimated win probability and its complementary loss probability. This real open record has about 88% predicted win probability. The second output explains the main input factors affecting that score. The CSV also includes a predicted class, a simple priority label and missing-data warnings. We should be careful with this example: the actual outcome is unknown, and this is a snapshot demonstration. We are not claiming that this score was available on the original engagement date, or that the priority label has proven business value.</w:t>
+        <w:t>Did history improve accuracy? For Logistic Regression, history has lower test AUC than raw inputs (B minus A -0.0070). This single exploratory comparison does not prove a general predictive benefit. We report that result directly.</w:t>
       </w:r>
     </w:p>
     <w:p>
       <w:r>
-        <w:t>Slide 10: Calibration helps scale, not ranking</w:t>
+        <w:t>Why not select the highest test score? The highest observed test AUC is 0.5424 from raw / CatBoost, but the selection rule uses validation. Changing the rule after seeing test results would make our evaluation less trustworthy.</w:t>
       </w:r>
     </w:p>
     <w:p>
       <w:r>
-        <w:t>Hoang Thien Bao Bui</w:t>
+        <w:t>Is this an agent or a chatbot? It is a deterministic decision-support agent. It observes a prediction and evidence, applies explicit rules, and recommends review actions. It has no LLM, autonomous planning, or ability to contact customers.</w:t>
       </w:r>
     </w:p>
     <w:p>
       <w:r>
-        <w:t>We used validation data to adjust the probability scale. On the test set, we compare the Brier score before and after calibration. A lower score is better, but calibration does not improve the ordering of deals. The base model stays frozen so the calibration still matches it. Our priority cutoffs are only examples and need business validation. We also have limits from using only observed closed outcomes, changes over time and missing account information. So this version should be treated as a research demonstration, not a production sales tool.</w:t>
+        <w:t>Why are past close values allowed? They belong to other training deals that closed before the query date. The current opportunity's final value is never used by the legitimate predictor. The audit records the latest eligible past closure.</w:t>
       </w:r>
     </w:p>
     <w:p>
       <w:r>
-        <w:t>Slide 11: What is complete?</w:t>
+        <w:t>What does the score mean? It is an estimated probability from a model trained on observed closed deals. It is not a guarantee for this opportunity, and it may not transfer to open deals with missing information.</w:t>
       </w:r>
     </w:p>
     <w:p>
       <w:r>
-        <w:t>Hoang Thien Bao Bui</w:t>
+        <w:t>Does the explanation prove why a sale is lost? No. It shows model sensitivity to input values. It does not prove a real causal effect or that changing the input will improve the outcome.</w:t>
       </w:r>
     </w:p>
     <w:p>
       <w:r>
-        <w:t>The main items from our proposal now have working code and generated outputs. We have data checks, exploratory analysis, all four promised models, the comparison metrics and confusion matrices. We also completed feature importance and the optional SHAP analysis. The workflow creates the open-deal CSV, figures, report and slides from the same run. This helps keep our presentation consistent with the code. The remaining checks involve the group account and final presentation review. We still need to confirm the notebook in our own Colab session and check the slides after import.</w:t>
+        <w:t>Why are the results weak? This snapshot has limited pre-close information. Historical sparsity, changing feature distributions and time drift may contribute. We have not isolated those causes experimentally.</w:t>
       </w:r>
     </w:p>
     <w:p>
       <w:r>
-        <w:t>Slide 12: Demo, review and next steps</w:t>
+        <w:t>How do you validate the agent? Tests check whether each rule fires under its stated evidence, whether actions are deterministic, and whether the live model matches the exported score. A user study and prospective intervention study remain future work.</w:t>
       </w:r>
     </w:p>
     <w:p>
       <w:r>
-        <w:t>Hoang Thien Bao Bui</w:t>
-      </w:r>
-    </w:p>
-    <w:p>
-      <w:r>
-        <w:t>For the demo, we can upload the project ZIP, run the notebook and inspect the generated results. We should check the run status, compare the models and open one scored opportunity with its explanation. Before submission, each member should review the report, rehearse their part and confirm the instructor schedule. The code is prepared for review in a pull request to our group repository. We should review the changes before merging. For future research, more useful pre-close activity data and a prospective test would matter more than simply adding another complex model. Thank you. We are happy to take questions.</w:t>
-      </w:r>
-    </w:p>
-    <w:p>
-      <w:r>
-        <w:t>Short Q&amp;A practice</w:t>
-      </w:r>
-    </w:p>
-    <w:p>
-      <w:r>
-        <w:t>What is the novelty? Our contribution is an explainable CRM workflow with checks for future information and missing inputs. It combines probability prediction with reasons and an audit trail. We are not claiming a new machine learning algorithm.</w:t>
-      </w:r>
-    </w:p>
-    <w:p>
-      <w:r>
-        <w:t>Why is the accuracy low? The available pre-close features contain little useful signal in this test. We prefer to report that honestly instead of using information that is only known after the outcome.</w:t>
-      </w:r>
-    </w:p>
-    <w:p>
-      <w:r>
-        <w:t>Why did you use TabNet? We promised to compare traditional models with an advanced tabular model. TabNet gives us that comparison, but it did not show a useful improvement here.</w:t>
-      </w:r>
-    </w:p>
-    <w:p>
-      <w:r>
-        <w:t>Can the sales team use the priority score now? It is a demonstration at this stage. We need better data coverage and a prospective test before using it to allocate sales effort.</w:t>
-      </w:r>
-    </w:p>
-    <w:p>
-      <w:r>
-        <w:t>What is the difference between SHAP and your local explanation? Our main output changes one input to a training reference and measures the score change. Those changes do not add up to the prediction. TreeSHAP is a separate additive explanation for the raw Random Forest.</w:t>
-      </w:r>
-    </w:p>
-    <w:p>
-      <w:r>
-        <w:t>What have you actually run? We ran all five models on CPU in the development environment. The notebook uses the same code. The group still needs to confirm the run in its own Colab account.</w:t>
-      </w:r>
-    </w:p>
-    <w:p>
-      <w:r>
-        <w:t>Is this an intelligent agent? This version is a supervised decision-support pipeline. The proposal did not require an autonomous agent, and we do not claim one.</w:t>
-      </w:r>
-    </w:p>
-    <w:p>
-      <w:r>
-        <w:t>Does a 70 percent score mean this particular deal will win? No. It is a model estimate, not a guarantee. Calibration, missing inputs and changes in the data all affect how much we can trust it.</w:t>
+        <w:t>Can we call this excellent? The implementation adds testable novelty and a reproducible demonstration. The professor decides the grade. Weak predictive performance and unvalidated business value remain limitations, so we should not promise an excellent grade.</w:t>
       </w:r>
     </w:p>
     <w:sectPr>
       <w:pgSz w:w="12240" w:h="15840"/>
-      <w:pgMar w:top="1440" w:right="1800" w:bottom="1440" w:left="1800" w:header="720" w:footer="720" w:gutter="0"/>
+      <w:pgMar w:top="1008" w:right="1008" w:bottom="1008" w:left="1008" w:header="720" w:footer="720" w:gutter="0"/>
       <w:cols w:space="720"/>
       <w:docGrid w:linePitch="360"/>
     </w:sectPr>
@@ -618,6 +675,14 @@
     <w:name w:val="Normal"/>
     <w:qFormat/>
     <w:rsid w:val="00FC693F"/>
+    <w:pPr>
+      <w:spacing w:after="140" w:line="264" w:lineRule="auto"/>
+    </w:pPr>
+    <w:rPr>
+      <w:rFonts w:ascii="Arial" w:hAnsi="Arial"/>
+      <w:color w:val="000000"/>
+      <w:sz w:val="22"/>
+    </w:rPr>
   </w:style>
   <w:style w:type="paragraph" w:styleId="Header">
     <w:name w:val="header"/>
@@ -678,10 +743,10 @@
       <w:outlineLvl w:val="0"/>
     </w:pPr>
     <w:rPr>
-      <w:rFonts w:asciiTheme="majorHAnsi" w:eastAsiaTheme="majorEastAsia" w:hAnsiTheme="majorHAnsi" w:cstheme="majorBidi"/>
+      <w:rFonts w:asciiTheme="majorHAnsi" w:eastAsiaTheme="majorEastAsia" w:hAnsiTheme="majorHAnsi" w:cstheme="majorBidi" w:ascii="Arial" w:hAnsi="Arial"/>
       <w:b/>
       <w:bCs/>
-      <w:color w:val="365F91" w:themeColor="accent1" w:themeShade="BF"/>
+      <w:color w:val="000000"/>
       <w:sz w:val="28"/>
       <w:szCs w:val="28"/>
     </w:rPr>
@@ -702,10 +767,10 @@
       <w:outlineLvl w:val="1"/>
     </w:pPr>
     <w:rPr>
-      <w:rFonts w:asciiTheme="majorHAnsi" w:eastAsiaTheme="majorEastAsia" w:hAnsiTheme="majorHAnsi" w:cstheme="majorBidi"/>
+      <w:rFonts w:asciiTheme="majorHAnsi" w:eastAsiaTheme="majorEastAsia" w:hAnsiTheme="majorHAnsi" w:cstheme="majorBidi" w:ascii="Arial" w:hAnsi="Arial"/>
       <w:b/>
       <w:bCs/>
-      <w:color w:val="4F81BD" w:themeColor="accent1"/>
+      <w:color w:val="000000"/>
       <w:sz w:val="26"/>
       <w:szCs w:val="26"/>
     </w:rPr>
@@ -726,10 +791,10 @@
       <w:outlineLvl w:val="2"/>
     </w:pPr>
     <w:rPr>
-      <w:rFonts w:asciiTheme="majorHAnsi" w:eastAsiaTheme="majorEastAsia" w:hAnsiTheme="majorHAnsi" w:cstheme="majorBidi"/>
+      <w:rFonts w:asciiTheme="majorHAnsi" w:eastAsiaTheme="majorEastAsia" w:hAnsiTheme="majorHAnsi" w:cstheme="majorBidi" w:ascii="Arial" w:hAnsi="Arial"/>
       <w:b/>
       <w:bCs/>
-      <w:color w:val="4F81BD" w:themeColor="accent1"/>
+      <w:color w:val="000000"/>
     </w:rPr>
   </w:style>
   <w:style w:type="paragraph" w:styleId="Heading4">
@@ -960,15 +1025,12 @@
     <w:qFormat/>
     <w:rsid w:val="00FC693F"/>
     <w:pPr>
-      <w:pBdr>
-        <w:bottom w:val="single" w:sz="8" w:space="4" w:color="4F81BD" w:themeColor="accent1"/>
-      </w:pBdr>
       <w:spacing w:after="300" w:line="240" w:lineRule="auto"/>
       <w:contextualSpacing/>
     </w:pPr>
     <w:rPr>
-      <w:rFonts w:asciiTheme="majorHAnsi" w:eastAsiaTheme="majorEastAsia" w:hAnsiTheme="majorHAnsi" w:cstheme="majorBidi"/>
-      <w:color w:val="17365D" w:themeColor="text2" w:themeShade="BF"/>
+      <w:rFonts w:asciiTheme="majorHAnsi" w:eastAsiaTheme="majorEastAsia" w:hAnsiTheme="majorHAnsi" w:cstheme="majorBidi" w:ascii="Arial" w:hAnsi="Arial"/>
+      <w:color w:val="000000"/>
       <w:spacing w:val="5"/>
       <w:kern w:val="28"/>
       <w:sz w:val="52"/>
@@ -1447,9 +1509,6 @@
     <w:qFormat/>
     <w:rsid w:val="00FC693F"/>
     <w:pPr>
-      <w:pBdr>
-        <w:bottom w:val="single" w:sz="4" w:space="4" w:color="4F81BD" w:themeColor="accent1"/>
-      </w:pBdr>
       <w:spacing w:before="200" w:after="280"/>
       <w:ind w:left="936" w:right="936"/>
     </w:pPr>

</xml_diff>